<commit_message>
Eikev 5785 Full Sefer
</commit_message>
<xml_diff>
--- a/Files/05 - Devarim/03 - Eikev/5785/Eikev 5785.docx
+++ b/Files/05 - Devarim/03 - Eikev/5785/Eikev 5785.docx
@@ -876,7 +876,7 @@
         <w:rPr>
           <w:rFonts w:ascii="Times New Roman" w:hAnsi="Times New Roman" w:cs="Times New Roman"/>
         </w:rPr>
-        <w:t xml:space="preserve"> as brought in the sefer</w:t>
+        <w:t xml:space="preserve"> as brought in the sefer </w:t>
       </w:r>
       <w:r>
         <w:rPr>
@@ -1067,7 +1067,7 @@
           <w:rFonts w:ascii="Times New Roman" w:hAnsi="Times New Roman" w:cs="Times New Roman"/>
           <w:rtl/>
         </w:rPr>
-        <w:t>"</w:t>
+        <w:t>״</w:t>
       </w:r>
       <w:r>
         <w:rPr>
@@ -1207,7 +1207,7 @@
           <w:rFonts w:ascii="Times New Roman" w:hAnsi="Times New Roman" w:cs="Times New Roman" w:hint="cs"/>
           <w:rtl/>
         </w:rPr>
-        <w:t>י ק ו ק</w:t>
+        <w:t xml:space="preserve">י ק ו ק </w:t>
       </w:r>
       <w:r>
         <w:rPr>
@@ -1672,7 +1672,7 @@
           <w:rFonts w:ascii="Times New Roman" w:hAnsi="Times New Roman" w:cs="Times New Roman"/>
           <w:rtl/>
         </w:rPr>
-        <w:t>"</w:t>
+        <w:t>״</w:t>
       </w:r>
       <w:r>
         <w:rPr>

</xml_diff>